<commit_message>
Retry and fall back when Gemini is overloaded (503 high demand)
Gemini sometimes answers 503 UNAVAILABLE "This model is currently
experiencing high demand", which EduGenie surfaced as a hard error.
gemini_client.generate() now retries temporary errors (429, 500, 502,
503, 504, network timeouts) with exponential backoff, then tries the
models in GEMINI_FALLBACK_MODELS (default gemini-flash-latest,
gemini-flash-lite-latest). Invalid keys and bad requests still fail
immediately; an unknown model moves straight to the next one. If every
model is busy the API returns 503 with Retry-After and a clear message.

The UI shows a "retrying" hint during long waits and a Try again
button for retryable errors. Settings are documented in .env.example
and the README, and the project documents are regenerated to match.

Co-Authored-By: Claude Opus 5.5 <noreply@anthropic.com>
Claude-Session: https://claude.ai/code/session_01XWkySRoDhLqjcy5kKKZFXe
</commit_message>
<xml_diff>
--- a/Project Documents/2. Requirement Analysis/Solution Requirements.docx
+++ b/Project Documents/2. Requirement Analysis/Solution Requirements.docx
@@ -1291,7 +1291,7 @@
               <w:rPr>
                 <w:sz w:val="19"/>
               </w:rPr>
-              <w:t>Graceful error handling: missing key -&gt; 503, Gemini failure / invalid quiz -&gt; 502 with a clear message; local model falls back to Gemini.</w:t>
+              <w:t>Graceful error handling: automatic retry with exponential backoff and fallback models when Gemini is overloaded (503) or rate limited (429); missing key or still-busy Gemini -&gt; 503, other AI failures / invalid quiz -&gt; 502 with a clear message and a Try again button; local model falls back to Gemini.</w:t>
             </w:r>
           </w:p>
         </w:tc>
@@ -1308,7 +1308,7 @@
               <w:rPr>
                 <w:sz w:val="19"/>
               </w:rPr>
-              <w:t>No unhandled exceptions; 31 automated tests pass</w:t>
+              <w:t>No unhandled exceptions; 40 automated tests pass</w:t>
             </w:r>
           </w:p>
         </w:tc>

</xml_diff>